<commit_message>
Add CPRE Herefordshire (5 days) to bid
</commit_message>
<xml_diff>
--- a/docs/_bid.docx
+++ b/docs/_bid.docx
@@ -388,6 +388,39 @@
       </w:r>
       <w:r>
         <w:t xml:space="preserve">QGIS for field botany, and integration with Herefordshire Meadows work.</w:t>
+      </w:r>
+    </w:p>
+    <w:p>
+      <w:pPr>
+        <w:numPr>
+          <w:ilvl w:val="0"/>
+          <w:numId w:val="1001"/>
+        </w:numPr>
+      </w:pPr>
+      <w:r>
+        <w:rPr>
+          <w:b/>
+          <w:bCs/>
+        </w:rPr>
+        <w:t xml:space="preserve">CPRE Herefordshire</w:t>
+      </w:r>
+      <w:r>
+        <w:t xml:space="preserve"> </w:t>
+      </w:r>
+      <w:r>
+        <w:t xml:space="preserve">— 5 days. Historic landscape archive data,</w:t>
+      </w:r>
+      <w:r>
+        <w:t xml:space="preserve"> </w:t>
+      </w:r>
+      <w:r>
+        <w:t xml:space="preserve">georectification of CPRE-relevant maps and CPRE landscape photographs,</w:t>
+      </w:r>
+      <w:r>
+        <w:t xml:space="preserve"> </w:t>
+      </w:r>
+      <w:r>
+        <w:t xml:space="preserve">and training in using historic maps for landscape advocacy.</w:t>
       </w:r>
     </w:p>
     <w:p>
@@ -706,6 +739,44 @@
           </w:p>
         </w:tc>
       </w:tr>
+      <w:tr>
+        <w:tc>
+          <w:tcPr/>
+          <w:p>
+            <w:pPr>
+              <w:pStyle w:val="Compact"/>
+              <w:jc w:val="left"/>
+            </w:pPr>
+            <w:r>
+              <w:t xml:space="preserve">CPRE Herefordshire</w:t>
+            </w:r>
+          </w:p>
+        </w:tc>
+        <w:tc>
+          <w:tcPr/>
+          <w:p>
+            <w:pPr>
+              <w:pStyle w:val="Compact"/>
+              <w:jc w:val="right"/>
+            </w:pPr>
+            <w:r>
+              <w:t xml:space="preserve">2</w:t>
+            </w:r>
+          </w:p>
+        </w:tc>
+        <w:tc>
+          <w:tcPr/>
+          <w:p>
+            <w:pPr>
+              <w:pStyle w:val="Compact"/>
+              <w:jc w:val="left"/>
+            </w:pPr>
+            <w:r>
+              <w:t xml:space="preserve">Identify priority historic landscapes and CPRE photo archive content</w:t>
+            </w:r>
+          </w:p>
+        </w:tc>
+      </w:tr>
     </w:tbl>
     <w:p>
       <w:pPr>
@@ -1027,6 +1098,44 @@
           </w:p>
         </w:tc>
       </w:tr>
+      <w:tr>
+        <w:tc>
+          <w:tcPr/>
+          <w:p>
+            <w:pPr>
+              <w:pStyle w:val="Compact"/>
+              <w:jc w:val="left"/>
+            </w:pPr>
+            <w:r>
+              <w:t xml:space="preserve">CPRE Herefordshire</w:t>
+            </w:r>
+          </w:p>
+        </w:tc>
+        <w:tc>
+          <w:tcPr/>
+          <w:p>
+            <w:pPr>
+              <w:pStyle w:val="Compact"/>
+              <w:jc w:val="right"/>
+            </w:pPr>
+            <w:r>
+              <w:t xml:space="preserve">2</w:t>
+            </w:r>
+          </w:p>
+        </w:tc>
+        <w:tc>
+          <w:tcPr/>
+          <w:p>
+            <w:pPr>
+              <w:pStyle w:val="Compact"/>
+              <w:jc w:val="left"/>
+            </w:pPr>
+            <w:r>
+              <w:t xml:space="preserve">Provide CPRE landscape photo locations and historic landscape data</w:t>
+            </w:r>
+          </w:p>
+        </w:tc>
+      </w:tr>
     </w:tbl>
     <w:p>
       <w:pPr>
@@ -1305,6 +1414,44 @@
           </w:p>
         </w:tc>
       </w:tr>
+      <w:tr>
+        <w:tc>
+          <w:tcPr/>
+          <w:p>
+            <w:pPr>
+              <w:pStyle w:val="Compact"/>
+              <w:jc w:val="left"/>
+            </w:pPr>
+            <w:r>
+              <w:t xml:space="preserve">CPRE Herefordshire</w:t>
+            </w:r>
+          </w:p>
+        </w:tc>
+        <w:tc>
+          <w:tcPr/>
+          <w:p>
+            <w:pPr>
+              <w:pStyle w:val="Compact"/>
+              <w:jc w:val="right"/>
+            </w:pPr>
+            <w:r>
+              <w:t xml:space="preserve">1</w:t>
+            </w:r>
+          </w:p>
+        </w:tc>
+        <w:tc>
+          <w:tcPr/>
+          <w:p>
+            <w:pPr>
+              <w:pStyle w:val="Compact"/>
+              <w:jc w:val="left"/>
+            </w:pPr>
+            <w:r>
+              <w:t xml:space="preserve">Contribute historic landscape perspective and CPRE use cases</w:t>
+            </w:r>
+          </w:p>
+        </w:tc>
+      </w:tr>
     </w:tbl>
     <w:p>
       <w:pPr>
@@ -1359,7 +1506,7 @@
         </w:numPr>
       </w:pPr>
       <w:r>
-        <w:t xml:space="preserve">Stakeholders (Herefordshire Meadows, ATF, Woolhope Club, Homme House)</w:t>
+        <w:t xml:space="preserve">Stakeholders (Herefordshire Meadows, ATF, CPRE, Woolhope Club, Homme House)</w:t>
       </w:r>
       <w:r>
         <w:t xml:space="preserve"> </w:t>
@@ -2214,6 +2361,80 @@
           </w:p>
         </w:tc>
       </w:tr>
+      <w:tr>
+        <w:tc>
+          <w:tcPr/>
+          <w:p>
+            <w:pPr>
+              <w:pStyle w:val="Compact"/>
+              <w:jc w:val="left"/>
+            </w:pPr>
+            <w:r>
+              <w:t xml:space="preserve">CPRE Herefordshire</w:t>
+            </w:r>
+          </w:p>
+        </w:tc>
+        <w:tc>
+          <w:tcPr/>
+          <w:p>
+            <w:pPr>
+              <w:pStyle w:val="Compact"/>
+              <w:jc w:val="right"/>
+            </w:pPr>
+            <w:r>
+              <w:t xml:space="preserve">2</w:t>
+            </w:r>
+          </w:p>
+        </w:tc>
+        <w:tc>
+          <w:tcPr/>
+          <w:p>
+            <w:pPr>
+              <w:pStyle w:val="Compact"/>
+              <w:jc w:val="right"/>
+            </w:pPr>
+            <w:r>
+              <w:t xml:space="preserve">2</w:t>
+            </w:r>
+          </w:p>
+        </w:tc>
+        <w:tc>
+          <w:tcPr/>
+          <w:p>
+            <w:pPr>
+              <w:pStyle w:val="Compact"/>
+              <w:jc w:val="right"/>
+            </w:pPr>
+            <w:r>
+              <w:t xml:space="preserve">1</w:t>
+            </w:r>
+          </w:p>
+        </w:tc>
+        <w:tc>
+          <w:tcPr/>
+          <w:p>
+            <w:pPr>
+              <w:pStyle w:val="Compact"/>
+              <w:jc w:val="right"/>
+            </w:pPr>
+            <w:r>
+              <w:t xml:space="preserve">0</w:t>
+            </w:r>
+          </w:p>
+        </w:tc>
+        <w:tc>
+          <w:tcPr/>
+          <w:p>
+            <w:pPr>
+              <w:pStyle w:val="Compact"/>
+              <w:jc w:val="right"/>
+            </w:pPr>
+            <w:r>
+              <w:t xml:space="preserve">5</w:t>
+            </w:r>
+          </w:p>
+        </w:tc>
+      </w:tr>
     </w:tbl>
     <w:p>
       <w:pPr>
@@ -2224,7 +2445,7 @@
           <w:b/>
           <w:bCs/>
         </w:rPr>
-        <w:t xml:space="preserve">Total person-days: 34</w:t>
+        <w:t xml:space="preserve">Total person-days: 39</w:t>
       </w:r>
     </w:p>
     <w:p>
@@ -2797,6 +3018,52 @@
               <w:pStyle w:val="Compact"/>
             </w:pPr>
             <w:r>
+              <w:t xml:space="preserve">CPRE Herefordshire</w:t>
+            </w:r>
+          </w:p>
+        </w:tc>
+        <w:tc>
+          <w:tcPr/>
+          <w:p>
+            <w:pPr>
+              <w:pStyle w:val="Compact"/>
+            </w:pPr>
+            <w:r>
+              <w:t xml:space="preserve">5</w:t>
+            </w:r>
+          </w:p>
+        </w:tc>
+        <w:tc>
+          <w:tcPr/>
+          <w:p>
+            <w:pPr>
+              <w:pStyle w:val="Compact"/>
+            </w:pPr>
+            <w:r>
+              <w:t xml:space="preserve">TBC</w:t>
+            </w:r>
+          </w:p>
+        </w:tc>
+        <w:tc>
+          <w:tcPr/>
+          <w:p>
+            <w:pPr>
+              <w:pStyle w:val="Compact"/>
+            </w:pPr>
+            <w:r>
+              <w:t xml:space="preserve">TBC</w:t>
+            </w:r>
+          </w:p>
+        </w:tc>
+      </w:tr>
+      <w:tr>
+        <w:tc>
+          <w:tcPr/>
+          <w:p>
+            <w:pPr>
+              <w:pStyle w:val="Compact"/>
+            </w:pPr>
+            <w:r>
               <w:rPr>
                 <w:b/>
                 <w:bCs/>
@@ -2816,7 +3083,7 @@
                 <w:b/>
                 <w:bCs/>
               </w:rPr>
-              <w:t xml:space="preserve">34</w:t>
+              <w:t xml:space="preserve">39</w:t>
             </w:r>
           </w:p>
         </w:tc>

</xml_diff>

<commit_message>
Reword stakeholder descriptions: Explore, collate and publish...
</commit_message>
<xml_diff>
--- a/docs/_bid.docx
+++ b/docs/_bid.docx
@@ -171,19 +171,19 @@
         <w:t xml:space="preserve"> </w:t>
       </w:r>
       <w:r>
-        <w:t xml:space="preserve">— 5 days. Georectification of meadow</w:t>
-      </w:r>
-      <w:r>
-        <w:t xml:space="preserve"> </w:t>
-      </w:r>
-      <w:r>
-        <w:t xml:space="preserve">sites, veteran tree survey data, QGIS training, and open access to archive</w:t>
-      </w:r>
-      <w:r>
-        <w:t xml:space="preserve"> </w:t>
-      </w:r>
-      <w:r>
-        <w:t xml:space="preserve">information.</w:t>
+        <w:t xml:space="preserve">— 5 days. Explore, collate and publish meadow</w:t>
+      </w:r>
+      <w:r>
+        <w:t xml:space="preserve"> </w:t>
+      </w:r>
+      <w:r>
+        <w:t xml:space="preserve">survey data, veteran tree records and tithe maps relevant to grassland</w:t>
+      </w:r>
+      <w:r>
+        <w:t xml:space="preserve"> </w:t>
+      </w:r>
+      <w:r>
+        <w:t xml:space="preserve">restoration sites across the county.</w:t>
       </w:r>
     </w:p>
     <w:p>
@@ -204,19 +204,19 @@
         <w:t xml:space="preserve"> </w:t>
       </w:r>
       <w:r>
-        <w:t xml:space="preserve">— 2 days. Habitat survey data,</w:t>
-      </w:r>
-      <w:r>
-        <w:t xml:space="preserve"> </w:t>
-      </w:r>
-      <w:r>
-        <w:t xml:space="preserve">nature reserve boundary overlays, and training in using historic maps for</w:t>
-      </w:r>
-      <w:r>
-        <w:t xml:space="preserve"> </w:t>
-      </w:r>
-      <w:r>
-        <w:t xml:space="preserve">landscape recovery.</w:t>
+        <w:t xml:space="preserve">— 2 days. Explore, collate and publish</w:t>
+      </w:r>
+      <w:r>
+        <w:t xml:space="preserve"> </w:t>
+      </w:r>
+      <w:r>
+        <w:t xml:space="preserve">habitat survey data and nature reserve records for landscape recovery</w:t>
+      </w:r>
+      <w:r>
+        <w:t xml:space="preserve"> </w:t>
+      </w:r>
+      <w:r>
+        <w:t xml:space="preserve">planning.</w:t>
       </w:r>
     </w:p>
     <w:p>
@@ -243,13 +243,19 @@
         <w:t xml:space="preserve"> </w:t>
       </w:r>
       <w:r>
-        <w:t xml:space="preserve">Lovelace’s project lead time. Archive transfer to their library,</w:t>
-      </w:r>
-      <w:r>
-        <w:t xml:space="preserve"> </w:t>
-      </w:r>
-      <w:r>
-        <w:t xml:space="preserve">access to tithe maps and survey photographs for their 600+ members.</w:t>
+        <w:t xml:space="preserve">Lovelace’s project lead time. Explore, collate and transfer tithe map</w:t>
+      </w:r>
+      <w:r>
+        <w:t xml:space="preserve"> </w:t>
+      </w:r>
+      <w:r>
+        <w:t xml:space="preserve">records, parish survey photographs and historic documents to the Club’s</w:t>
+      </w:r>
+      <w:r>
+        <w:t xml:space="preserve"> </w:t>
+      </w:r>
+      <w:r>
+        <w:t xml:space="preserve">library for their 600+ members.</w:t>
       </w:r>
     </w:p>
     <w:p>
@@ -276,19 +282,19 @@
         <w:t xml:space="preserve"> </w:t>
       </w:r>
       <w:r>
-        <w:t xml:space="preserve">Lovelace’s project lead time. Transfer of priority digital and</w:t>
-      </w:r>
-      <w:r>
-        <w:t xml:space="preserve"> </w:t>
-      </w:r>
-      <w:r>
-        <w:t xml:space="preserve">physical materials, ensuring long-term public access and integration with</w:t>
-      </w:r>
-      <w:r>
-        <w:t xml:space="preserve"> </w:t>
-      </w:r>
-      <w:r>
-        <w:t xml:space="preserve">existing collections.</w:t>
+        <w:t xml:space="preserve">Lovelace’s project lead time. Explore, collate and transfer priority</w:t>
+      </w:r>
+      <w:r>
+        <w:t xml:space="preserve"> </w:t>
+      </w:r>
+      <w:r>
+        <w:t xml:space="preserve">digital and physical materials for long-term public access and integration</w:t>
+      </w:r>
+      <w:r>
+        <w:t xml:space="preserve"> </w:t>
+      </w:r>
+      <w:r>
+        <w:t xml:space="preserve">with existing collections.</w:t>
       </w:r>
     </w:p>
     <w:p>
@@ -309,19 +315,19 @@
         <w:t xml:space="preserve"> </w:t>
       </w:r>
       <w:r>
-        <w:t xml:space="preserve">— 5 days. LOWVP Veteran Tree</w:t>
-      </w:r>
-      <w:r>
-        <w:t xml:space="preserve"> </w:t>
-      </w:r>
-      <w:r>
-        <w:t xml:space="preserve">Survey made openly accessible and cross-referenced with the Ancient</w:t>
-      </w:r>
-      <w:r>
-        <w:t xml:space="preserve"> </w:t>
-      </w:r>
-      <w:r>
-        <w:t xml:space="preserve">Tree Inventory, ground-truthing field work, and training.</w:t>
+        <w:t xml:space="preserve">— 5 days. Explore, collate and publish the</w:t>
+      </w:r>
+      <w:r>
+        <w:t xml:space="preserve"> </w:t>
+      </w:r>
+      <w:r>
+        <w:t xml:space="preserve">LOWVP Veteran Tree Survey, cross-referenced with the Ancient Tree Inventory,</w:t>
+      </w:r>
+      <w:r>
+        <w:t xml:space="preserve"> </w:t>
+      </w:r>
+      <w:r>
+        <w:t xml:space="preserve">for national conservation planning.</w:t>
       </w:r>
     </w:p>
     <w:p>
@@ -342,19 +348,19 @@
         <w:t xml:space="preserve"> </w:t>
       </w:r>
       <w:r>
-        <w:t xml:space="preserve">— 2 days (in-kind). Inclusion as a</w:t>
-      </w:r>
-      <w:r>
-        <w:t xml:space="preserve"> </w:t>
-      </w:r>
-      <w:r>
-        <w:t xml:space="preserve">case study site, georectification of estate records, parkland tree data</w:t>
-      </w:r>
-      <w:r>
-        <w:t xml:space="preserve"> </w:t>
-      </w:r>
-      <w:r>
-        <w:t xml:space="preserve">digitisation, and training opportunities.</w:t>
+        <w:t xml:space="preserve">— 2 days (in-kind). Explore, collate and</w:t>
+      </w:r>
+      <w:r>
+        <w:t xml:space="preserve"> </w:t>
+      </w:r>
+      <w:r>
+        <w:t xml:space="preserve">digitise parkland tree records, historic estate features and Capability</w:t>
+      </w:r>
+      <w:r>
+        <w:t xml:space="preserve"> </w:t>
+      </w:r>
+      <w:r>
+        <w:t xml:space="preserve">Brown landscape data for use as a case study site.</w:t>
       </w:r>
     </w:p>
     <w:p>
@@ -375,19 +381,25 @@
         <w:t xml:space="preserve"> </w:t>
       </w:r>
       <w:r>
-        <w:t xml:space="preserve">— 5 days. Access to</w:t>
-      </w:r>
-      <w:r>
-        <w:t xml:space="preserve"> </w:t>
-      </w:r>
-      <w:r>
-        <w:t xml:space="preserve">the archive’s botanical and habitat records for VC36 recording, training in</w:t>
-      </w:r>
-      <w:r>
-        <w:t xml:space="preserve"> </w:t>
-      </w:r>
-      <w:r>
-        <w:t xml:space="preserve">QGIS for field botany, and integration with Herefordshire Meadows work.</w:t>
+        <w:t xml:space="preserve">— 5 days. Explore, collate and</w:t>
+      </w:r>
+      <w:r>
+        <w:t xml:space="preserve"> </w:t>
+      </w:r>
+      <w:r>
+        <w:t xml:space="preserve">publish botanical and habitat records from the archive for Herefordshire</w:t>
+      </w:r>
+      <w:r>
+        <w:t xml:space="preserve"> </w:t>
+      </w:r>
+      <w:r>
+        <w:t xml:space="preserve">VC36 recording, integrated with Herefordshire Meadows’ grassland</w:t>
+      </w:r>
+      <w:r>
+        <w:t xml:space="preserve"> </w:t>
+      </w:r>
+      <w:r>
+        <w:t xml:space="preserve">restoration work.</w:t>
       </w:r>
     </w:p>
     <w:p>
@@ -408,19 +420,19 @@
         <w:t xml:space="preserve"> </w:t>
       </w:r>
       <w:r>
-        <w:t xml:space="preserve">— 5 days. Historic landscape archive data,</w:t>
-      </w:r>
-      <w:r>
-        <w:t xml:space="preserve"> </w:t>
-      </w:r>
-      <w:r>
-        <w:t xml:space="preserve">georectification of CPRE-relevant maps and CPRE landscape photographs,</w:t>
-      </w:r>
-      <w:r>
-        <w:t xml:space="preserve"> </w:t>
-      </w:r>
-      <w:r>
-        <w:t xml:space="preserve">and training in using historic maps for landscape advocacy.</w:t>
+        <w:t xml:space="preserve">— 5 days. Explore, collate and publish historic</w:t>
+      </w:r>
+      <w:r>
+        <w:t xml:space="preserve"> </w:t>
+      </w:r>
+      <w:r>
+        <w:t xml:space="preserve">landscape data and CPRE photograph archive content for landscape advocacy</w:t>
+      </w:r>
+      <w:r>
+        <w:t xml:space="preserve"> </w:t>
+      </w:r>
+      <w:r>
+        <w:t xml:space="preserve">and planning.</w:t>
       </w:r>
     </w:p>
     <w:p>
@@ -466,9 +478,9 @@
         <w:tblCaption w:val="Workstream 1 — Stakeholder liaison and prioritisation effort"/>
       </w:tblPr>
       <w:tblGrid>
-        <w:gridCol w:w="2187"/>
-        <w:gridCol w:w="377"/>
-        <w:gridCol w:w="5355"/>
+        <w:gridCol w:w="2126"/>
+        <w:gridCol w:w="366"/>
+        <w:gridCol w:w="5426"/>
       </w:tblGrid>
       <w:tr>
         <w:trPr>
@@ -582,7 +594,7 @@
               <w:jc w:val="left"/>
             </w:pPr>
             <w:r>
-              <w:t xml:space="preserve">Botanical audit; identify priority meadows and woodland surveys</w:t>
+              <w:t xml:space="preserve">Explore botanical records; identify priority meadows and woodland surveys</w:t>
             </w:r>
           </w:p>
         </w:tc>
@@ -620,7 +632,7 @@
               <w:jc w:val="left"/>
             </w:pPr>
             <w:r>
-              <w:t xml:space="preserve">Audit veteran tree survey data; identify priority parishes for release</w:t>
+              <w:t xml:space="preserve">Explore veteran tree survey data; identify priority parishes for release</w:t>
             </w:r>
           </w:p>
         </w:tc>
@@ -658,7 +670,7 @@
               <w:jc w:val="left"/>
             </w:pPr>
             <w:r>
-              <w:t xml:space="preserve">Identify meadow restoration sites with matching archival records</w:t>
+              <w:t xml:space="preserve">Explore meadow restoration sites with matching archival records</w:t>
             </w:r>
           </w:p>
         </w:tc>
@@ -696,7 +708,7 @@
               <w:jc w:val="left"/>
             </w:pPr>
             <w:r>
-              <w:t xml:space="preserve">Identify nature reserve overlap with archive habitat data</w:t>
+              <w:t xml:space="preserve">Explore nature reserve overlap with archive habitat data</w:t>
             </w:r>
           </w:p>
         </w:tc>
@@ -734,7 +746,7 @@
               <w:jc w:val="left"/>
             </w:pPr>
             <w:r>
-              <w:t xml:space="preserve">Identify veteran parkland trees and estate records for inclusion</w:t>
+              <w:t xml:space="preserve">Explore veteran parkland trees and estate records for inclusion</w:t>
             </w:r>
           </w:p>
         </w:tc>
@@ -772,7 +784,7 @@
               <w:jc w:val="left"/>
             </w:pPr>
             <w:r>
-              <w:t xml:space="preserve">Identify priority historic landscapes and CPRE photo archive content</w:t>
+              <w:t xml:space="preserve">Explore historic landscapes and CPRE photo archive content</w:t>
             </w:r>
           </w:p>
         </w:tc>

</xml_diff>